<commit_message>
Tuto Word mis à jour avec URL GitHub correcte
</commit_message>
<xml_diff>
--- a/SIMUL_LAVE_25D_tuto.docx
+++ b/SIMUL_LAVE_25D_tuto.docx
@@ -5,12 +5,19 @@
     <w:p>
       <w:pPr>
         <w:jc w:val="center"/>
+        <w:rPr>
+          <w:b/>
+          <w:color w:val="CC3300"/>
+          <w:sz w:val="96"/>
+          <w:szCs w:val="32"/>
+        </w:rPr>
       </w:pPr>
       <w:r>
         <w:rPr>
           <w:b/>
           <w:color w:val="CC3300"/>
-          <w:sz w:val="52"/>
+          <w:sz w:val="96"/>
+          <w:szCs w:val="32"/>
         </w:rPr>
         <w:t>SIMUL_LAVE_2.5D</w:t>
       </w:r>
@@ -18,24 +25,269 @@
     <w:p>
       <w:pPr>
         <w:jc w:val="center"/>
+        <w:rPr>
+          <w:b/>
+          <w:color w:val="CC3300"/>
+          <w:sz w:val="40"/>
+          <w:szCs w:val="18"/>
+        </w:rPr>
+      </w:pPr>
+      <w:proofErr w:type="spellStart"/>
+      <w:r>
+        <w:rPr>
+          <w:b/>
+          <w:color w:val="CC3300"/>
+          <w:sz w:val="40"/>
+          <w:szCs w:val="18"/>
+        </w:rPr>
+        <w:t>Simulateur</w:t>
+      </w:r>
+      <w:proofErr w:type="spellEnd"/>
+      <w:r>
+        <w:rPr>
+          <w:b/>
+          <w:color w:val="CC3300"/>
+          <w:sz w:val="40"/>
+          <w:szCs w:val="18"/>
+        </w:rPr>
+        <w:t xml:space="preserve"> de coul</w:t>
+      </w:r>
+      <w:r>
+        <w:rPr>
+          <w:b/>
+          <w:color w:val="CC3300"/>
+          <w:sz w:val="40"/>
+          <w:szCs w:val="18"/>
+        </w:rPr>
+        <w:t>é</w:t>
+      </w:r>
+      <w:r>
+        <w:rPr>
+          <w:b/>
+          <w:color w:val="CC3300"/>
+          <w:sz w:val="40"/>
+          <w:szCs w:val="18"/>
+        </w:rPr>
+        <w:t xml:space="preserve">e de lave </w:t>
+      </w:r>
+    </w:p>
+    <w:p>
+      <w:pPr>
+        <w:jc w:val="center"/>
+        <w:rPr>
+          <w:sz w:val="18"/>
+          <w:szCs w:val="18"/>
+        </w:rPr>
+      </w:pPr>
+      <w:r>
+        <w:rPr>
+          <w:b/>
+          <w:color w:val="CC3300"/>
+          <w:sz w:val="40"/>
+          <w:szCs w:val="18"/>
+        </w:rPr>
+        <w:t xml:space="preserve">sur le relief de </w:t>
+      </w:r>
+      <w:proofErr w:type="spellStart"/>
+      <w:r>
+        <w:rPr>
+          <w:b/>
+          <w:color w:val="CC3300"/>
+          <w:sz w:val="40"/>
+          <w:szCs w:val="18"/>
+        </w:rPr>
+        <w:t>l’île</w:t>
+      </w:r>
+      <w:proofErr w:type="spellEnd"/>
+      <w:r>
+        <w:rPr>
+          <w:b/>
+          <w:color w:val="CC3300"/>
+          <w:sz w:val="40"/>
+          <w:szCs w:val="18"/>
+        </w:rPr>
+        <w:t xml:space="preserve"> de La Réunion</w:t>
+      </w:r>
+    </w:p>
+    <w:p>
+      <w:pPr>
+        <w:jc w:val="center"/>
+        <w:rPr>
+          <w:color w:val="666666"/>
+          <w:sz w:val="48"/>
+          <w:szCs w:val="40"/>
+        </w:rPr>
+      </w:pPr>
+    </w:p>
+    <w:p>
+      <w:pPr>
+        <w:jc w:val="center"/>
+        <w:rPr>
+          <w:color w:val="666666"/>
+          <w:sz w:val="48"/>
+          <w:szCs w:val="40"/>
+        </w:rPr>
+      </w:pPr>
+    </w:p>
+    <w:p>
+      <w:pPr>
+        <w:jc w:val="center"/>
+        <w:rPr>
+          <w:color w:val="666666"/>
+          <w:sz w:val="56"/>
+          <w:szCs w:val="48"/>
+        </w:rPr>
+      </w:pPr>
+      <w:r>
+        <w:rPr>
+          <w:color w:val="666666"/>
+          <w:sz w:val="56"/>
+          <w:szCs w:val="48"/>
+        </w:rPr>
+        <w:t xml:space="preserve">Guide </w:t>
+      </w:r>
+      <w:proofErr w:type="spellStart"/>
+      <w:r>
+        <w:rPr>
+          <w:color w:val="666666"/>
+          <w:sz w:val="56"/>
+          <w:szCs w:val="48"/>
+        </w:rPr>
+        <w:t>d'installation</w:t>
+      </w:r>
+      <w:proofErr w:type="spellEnd"/>
+      <w:r>
+        <w:rPr>
+          <w:color w:val="666666"/>
+          <w:sz w:val="56"/>
+          <w:szCs w:val="48"/>
+        </w:rPr>
+        <w:t xml:space="preserve"> et </w:t>
+      </w:r>
+      <w:proofErr w:type="spellStart"/>
+      <w:r>
+        <w:rPr>
+          <w:color w:val="666666"/>
+          <w:sz w:val="56"/>
+          <w:szCs w:val="48"/>
+        </w:rPr>
+        <w:t>d'utilisation</w:t>
+      </w:r>
+      <w:proofErr w:type="spellEnd"/>
+    </w:p>
+    <w:p>
+      <w:pPr>
+        <w:jc w:val="center"/>
+        <w:rPr>
+          <w:color w:val="666666"/>
+          <w:sz w:val="48"/>
+          <w:szCs w:val="40"/>
+        </w:rPr>
+      </w:pPr>
+    </w:p>
+    <w:p>
+      <w:pPr>
+        <w:jc w:val="center"/>
+        <w:rPr>
+          <w:color w:val="666666"/>
+          <w:sz w:val="48"/>
+          <w:szCs w:val="40"/>
+        </w:rPr>
+      </w:pPr>
+      <w:r>
+        <w:rPr>
+          <w:noProof/>
+          <w:sz w:val="40"/>
+          <w:szCs w:val="40"/>
+        </w:rPr>
+        <w:drawing>
+          <wp:inline distT="0" distB="0" distL="0" distR="0">
+            <wp:extent cx="3309761" cy="3172178"/>
+            <wp:effectExtent l="0" t="0" r="5080" b="3175"/>
+            <wp:docPr id="1333529217" name="Image 1"/>
+            <wp:cNvGraphicFramePr>
+              <a:graphicFrameLocks xmlns:a="http://schemas.openxmlformats.org/drawingml/2006/main" noChangeAspect="1"/>
+            </wp:cNvGraphicFramePr>
+            <a:graphic xmlns:a="http://schemas.openxmlformats.org/drawingml/2006/main">
+              <a:graphicData uri="http://schemas.openxmlformats.org/drawingml/2006/picture">
+                <pic:pic xmlns:pic="http://schemas.openxmlformats.org/drawingml/2006/picture">
+                  <pic:nvPicPr>
+                    <pic:cNvPr id="1333529217" name="Image 1333529217"/>
+                    <pic:cNvPicPr/>
+                  </pic:nvPicPr>
+                  <pic:blipFill>
+                    <a:blip r:embed="rId6"/>
+                    <a:stretch>
+                      <a:fillRect/>
+                    </a:stretch>
+                  </pic:blipFill>
+                  <pic:spPr>
+                    <a:xfrm>
+                      <a:off x="0" y="0"/>
+                      <a:ext cx="3367833" cy="3227836"/>
+                    </a:xfrm>
+                    <a:prstGeom prst="rect">
+                      <a:avLst/>
+                    </a:prstGeom>
+                  </pic:spPr>
+                </pic:pic>
+              </a:graphicData>
+            </a:graphic>
+          </wp:inline>
+        </w:drawing>
+      </w:r>
+    </w:p>
+    <w:p>
+      <w:pPr>
+        <w:jc w:val="center"/>
+        <w:rPr>
+          <w:color w:val="666666"/>
+          <w:sz w:val="28"/>
+        </w:rPr>
+      </w:pPr>
+    </w:p>
+    <w:p>
+      <w:pPr>
+        <w:jc w:val="center"/>
+        <w:rPr>
+          <w:color w:val="666666"/>
+          <w:sz w:val="28"/>
+        </w:rPr>
       </w:pPr>
       <w:r>
         <w:rPr>
           <w:color w:val="666666"/>
           <w:sz w:val="28"/>
         </w:rPr>
-        <w:t>Guide d'installation et d'utilisation</w:t>
+        <w:t>Olivier Hoarau</w:t>
       </w:r>
     </w:p>
     <w:p>
       <w:pPr>
-        <w:pStyle w:val="Titre1"/>
-      </w:pPr>
+        <w:jc w:val="center"/>
+      </w:pPr>
+      <w:r>
+        <w:rPr>
+          <w:color w:val="666666"/>
+          <w:sz w:val="28"/>
+        </w:rPr>
+        <w:t>Mai 2026</w:t>
+      </w:r>
+    </w:p>
+    <w:p>
       <w:r>
         <w:rPr>
           <w:color w:val="CC3300"/>
           <w:sz w:val="36"/>
         </w:rPr>
+        <w:br w:type="page"/>
+      </w:r>
+      <w:r>
+        <w:rPr>
+          <w:color w:val="CC3300"/>
+          <w:sz w:val="36"/>
+        </w:rPr>
+        <w:lastRenderedPageBreak/>
         <w:t xml:space="preserve">Ce </w:t>
       </w:r>
       <w:proofErr w:type="spellStart"/>
@@ -214,6 +466,7 @@
         </w:tc>
       </w:tr>
     </w:tbl>
+    <w:p/>
     <w:p>
       <w:pPr>
         <w:pStyle w:val="Titre1"/>
@@ -223,23 +476,7 @@
           <w:color w:val="CC3300"/>
           <w:sz w:val="36"/>
         </w:rPr>
-        <w:t xml:space="preserve">Étape 1 — </w:t>
-      </w:r>
-      <w:proofErr w:type="spellStart"/>
-      <w:r>
-        <w:rPr>
-          <w:color w:val="CC3300"/>
-          <w:sz w:val="36"/>
-        </w:rPr>
-        <w:t>Récupérer</w:t>
-      </w:r>
-      <w:proofErr w:type="spellEnd"/>
-      <w:r>
-        <w:rPr>
-          <w:color w:val="CC3300"/>
-          <w:sz w:val="36"/>
-        </w:rPr>
-        <w:t xml:space="preserve"> les fichiers</w:t>
+        <w:t>Étape 1 — Récupérer les fichiers</w:t>
       </w:r>
     </w:p>
     <w:p>
@@ -270,7 +507,7 @@
           <w:color w:val="222222"/>
           <w:sz w:val="18"/>
         </w:rPr>
-        <w:t>git clone https://github.com/VOTRE_COMPTE/simul-lave-reunion.git</w:t>
+        <w:t>git clone https://github.com/olivierhoarau97410/simulateurcouleeV2.git</w:t>
       </w:r>
     </w:p>
     <w:p>
@@ -284,7 +521,7 @@
           <w:color w:val="222222"/>
           <w:sz w:val="18"/>
         </w:rPr>
-        <w:t>cd simul-lave-reunion</w:t>
+        <w:t>cd simulateurcouleeV2</w:t>
       </w:r>
     </w:p>
     <w:p>
@@ -293,18 +530,38 @@
           <w:i/>
           <w:color w:val="446688"/>
         </w:rPr>
-        <w:t>ℹ  Le dépôt contient le simulateur HTML + les tuiles terrain (~860 Mo). Le téléchargement peut prendre quelques minutes.</w:t>
+        <w:t>ℹ  Le dépôt contient le simulateur HTML et les scripts. Les tuiles terrain sont à télécharger séparément (voir ci-dessous).</w:t>
       </w:r>
     </w:p>
     <w:p>
       <w:pPr>
-        <w:pStyle w:val="Titre2"/>
+        <w:rPr>
+          <w:rFonts w:asciiTheme="majorHAnsi" w:eastAsiaTheme="majorEastAsia" w:hAnsiTheme="majorHAnsi" w:cstheme="majorBidi"/>
+          <w:b/>
+          <w:bCs/>
+          <w:color w:val="333333"/>
+          <w:sz w:val="28"/>
+          <w:szCs w:val="26"/>
+        </w:rPr>
       </w:pPr>
       <w:r>
         <w:rPr>
           <w:color w:val="333333"/>
           <w:sz w:val="28"/>
         </w:rPr>
+        <w:br w:type="page"/>
+      </w:r>
+    </w:p>
+    <w:p>
+      <w:pPr>
+        <w:pStyle w:val="Titre2"/>
+      </w:pPr>
+      <w:r>
+        <w:rPr>
+          <w:color w:val="333333"/>
+          <w:sz w:val="28"/>
+        </w:rPr>
+        <w:lastRenderedPageBreak/>
         <w:t>Option B — Archive ZIP</w:t>
       </w:r>
     </w:p>
@@ -314,19 +571,9 @@
       </w:r>
     </w:p>
     <w:p>
-      <w:pPr>
-        <w:pStyle w:val="Titre2"/>
-        <w:rPr>
-          <w:color w:val="333333"/>
-          <w:sz w:val="28"/>
-        </w:rPr>
-        <w:sectPr>
-          <w:pgSz w:w="12240" w:h="15840"/>
-          <w:pgMar w:top="1134" w:right="1417" w:bottom="1134" w:left="1417" w:header="720" w:footer="720" w:gutter="0"/>
-          <w:cols w:space="720"/>
-          <w:docGrid w:linePitch="360"/>
-        </w:sectPr>
-      </w:pPr>
+      <w:r>
+        <w:t>URL du dépôt : https://github.com/olivierhoarau97410/simulateurcouleeV2</w:t>
+      </w:r>
     </w:p>
     <w:p>
       <w:pPr>
@@ -337,34 +584,13 @@
           <w:color w:val="333333"/>
           <w:sz w:val="28"/>
         </w:rPr>
-        <w:lastRenderedPageBreak/>
-        <w:t xml:space="preserve">Structure des </w:t>
+        <w:t>Télécharger les tuiles terrain (obligatoire)</w:t>
       </w:r>
-      <w:proofErr w:type="spellStart"/>
+    </w:p>
+    <w:p>
       <w:r>
-        <w:rPr>
-          <w:color w:val="333333"/>
-          <w:sz w:val="28"/>
-        </w:rPr>
-        <w:t>fichiers</w:t>
+        <w:t>Les tuiles terrain (~860 Mo) sont trop volumineuses pour être incluses dans le dépôt Git. Elles sont disponibles séparément dans la section Releases :</w:t>
       </w:r>
-      <w:proofErr w:type="spellEnd"/>
-      <w:r>
-        <w:rPr>
-          <w:color w:val="333333"/>
-          <w:sz w:val="28"/>
-        </w:rPr>
-        <w:t xml:space="preserve"> </w:t>
-      </w:r>
-      <w:proofErr w:type="spellStart"/>
-      <w:r>
-        <w:rPr>
-          <w:color w:val="333333"/>
-          <w:sz w:val="28"/>
-        </w:rPr>
-        <w:t>obtenue</w:t>
-      </w:r>
-      <w:proofErr w:type="spellEnd"/>
     </w:p>
     <w:p>
       <w:pPr>
@@ -377,7 +603,58 @@
           <w:color w:val="222222"/>
           <w:sz w:val="18"/>
         </w:rPr>
-        <w:t>simul-lave-reunion/</w:t>
+        <w:t>https://github.com/olivierhoarau97410/simulateurcouleeV2/releases</w:t>
+      </w:r>
+    </w:p>
+    <w:p>
+      <w:pPr>
+        <w:pStyle w:val="Listepuces"/>
+      </w:pPr>
+      <w:r>
+        <w:t>Téléchargez  tiles_terrain.zip  depuis la Release v2.0</w:t>
+      </w:r>
+    </w:p>
+    <w:p>
+      <w:pPr>
+        <w:pStyle w:val="Listepuces"/>
+      </w:pPr>
+      <w:r>
+        <w:t>Décompressez l'archive dans le dossier du projet — vous obtenez  tiles/terrain/</w:t>
+      </w:r>
+    </w:p>
+    <w:p>
+      <w:r>
+        <w:rPr>
+          <w:i/>
+          <w:color w:val="446688"/>
+        </w:rPr>
+        <w:t>ℹ  Sans ces tuiles, la carte reste noire au démarrage.</w:t>
+      </w:r>
+    </w:p>
+    <w:p>
+      <w:pPr>
+        <w:pStyle w:val="Titre2"/>
+      </w:pPr>
+      <w:r>
+        <w:rPr>
+          <w:color w:val="333333"/>
+          <w:sz w:val="28"/>
+        </w:rPr>
+        <w:t>Structure des fichiers obtenue</w:t>
+      </w:r>
+    </w:p>
+    <w:p>
+      <w:pPr>
+        <w:shd w:val="clear" w:color="auto" w:fill="F0F0F0"/>
+        <w:ind w:left="283"/>
+      </w:pPr>
+      <w:r>
+        <w:rPr>
+          <w:rFonts w:ascii="Courier New" w:hAnsi="Courier New"/>
+          <w:color w:val="222222"/>
+          <w:sz w:val="18"/>
+        </w:rPr>
+        <w:t>simulateurcouleeV2/</w:t>
       </w:r>
       <w:r>
         <w:rPr>
@@ -404,7 +681,34 @@
           <w:sz w:val="18"/>
         </w:rPr>
         <w:br/>
-        <w:t>├── recompute_hillshade.py     ← utilitaire optionnel</w:t>
+        <w:t>├── download_lidar_hd.py       ← téléchargement LiDAR IGN</w:t>
+      </w:r>
+      <w:r>
+        <w:rPr>
+          <w:rFonts w:ascii="Courier New" w:hAnsi="Courier New"/>
+          <w:color w:val="222222"/>
+          <w:sz w:val="18"/>
+        </w:rPr>
+        <w:br/>
+        <w:t>├── preprocess_tiles.py        ← génération des tuiles</w:t>
+      </w:r>
+      <w:r>
+        <w:rPr>
+          <w:rFonts w:ascii="Courier New" w:hAnsi="Courier New"/>
+          <w:color w:val="222222"/>
+          <w:sz w:val="18"/>
+        </w:rPr>
+        <w:br/>
+        <w:t>├── recompute_hillshade.py     ← correction hillshade</w:t>
+      </w:r>
+      <w:r>
+        <w:rPr>
+          <w:rFonts w:ascii="Courier New" w:hAnsi="Courier New"/>
+          <w:color w:val="222222"/>
+          <w:sz w:val="18"/>
+        </w:rPr>
+        <w:br/>
+        <w:t>├── requirements.txt           ← dépendances Python</w:t>
       </w:r>
       <w:r>
         <w:rPr>
@@ -449,7 +753,7 @@
           <w:sz w:val="18"/>
         </w:rPr>
         <w:br/>
-        <w:t xml:space="preserve">    └── terrain/</w:t>
+        <w:t xml:space="preserve">    └── terrain/               ← à décompresser depuis tiles_terrain.zip</w:t>
       </w:r>
       <w:r>
         <w:rPr>
@@ -479,6 +783,7 @@
         <w:t xml:space="preserve">        └── …</w:t>
       </w:r>
     </w:p>
+    <w:p/>
     <w:p>
       <w:pPr>
         <w:pStyle w:val="Titre1"/>
@@ -561,6 +866,14 @@
           <w:sz w:val="18"/>
         </w:rPr>
         <w:br/>
+      </w:r>
+      <w:r>
+        <w:rPr>
+          <w:rFonts w:ascii="Courier New" w:hAnsi="Courier New"/>
+          <w:color w:val="222222"/>
+          <w:sz w:val="18"/>
+        </w:rPr>
+        <w:lastRenderedPageBreak/>
         <w:t xml:space="preserve">  ✅  Serveur démarré sur http://localhost:8765</w:t>
       </w:r>
       <w:r>
@@ -663,7 +976,6 @@
           <w:color w:val="CC3300"/>
           <w:sz w:val="36"/>
         </w:rPr>
-        <w:lastRenderedPageBreak/>
         <w:t>Étape 3 — Utiliser le simulateur</w:t>
       </w:r>
     </w:p>
@@ -964,6 +1276,7 @@
                 <w:b/>
                 <w:color w:val="CC3300"/>
               </w:rPr>
+              <w:lastRenderedPageBreak/>
               <w:t>Mode</w:t>
             </w:r>
           </w:p>
@@ -1214,7 +1527,6 @@
           <w:color w:val="333333"/>
           <w:sz w:val="28"/>
         </w:rPr>
-        <w:lastRenderedPageBreak/>
         <w:t>Ce que vous observez sur la carte</w:t>
       </w:r>
     </w:p>
@@ -1300,25 +1612,10 @@
         <w:pStyle w:val="Listepuces"/>
       </w:pPr>
       <w:r>
-        <w:t xml:space="preserve">Faites Pause, changez le mode de vue, </w:t>
-      </w:r>
-      <w:proofErr w:type="spellStart"/>
-      <w:r>
-        <w:t>puis</w:t>
-      </w:r>
-      <w:proofErr w:type="spellEnd"/>
-      <w:r>
-        <w:t xml:space="preserve"> </w:t>
-      </w:r>
-      <w:proofErr w:type="spellStart"/>
-      <w:r>
-        <w:t>Reprenez</w:t>
-      </w:r>
-      <w:proofErr w:type="spellEnd"/>
-      <w:r>
-        <w:t xml:space="preserve"> pour comparer</w:t>
+        <w:t>Faites Pause, changez le mode de vue, puis Reprenez pour comparer</w:t>
       </w:r>
     </w:p>
+    <w:p/>
     <w:p>
       <w:pPr>
         <w:pStyle w:val="Titre1"/>
@@ -1345,6 +1642,7 @@
           <w:color w:val="333333"/>
           <w:sz w:val="28"/>
         </w:rPr>
+        <w:lastRenderedPageBreak/>
         <w:t>1. Télécharger le LiDAR HD de La Réunion</w:t>
       </w:r>
     </w:p>
@@ -1458,7 +1756,6 @@
           <w:color w:val="CC3300"/>
           <w:sz w:val="36"/>
         </w:rPr>
-        <w:lastRenderedPageBreak/>
         <w:t>Problèmes fréquents</w:t>
       </w:r>
     </w:p>
@@ -1530,6 +1827,7 @@
         <w:t>Fermez les autres onglets du navigateur. Le simulateur calcule ~1 million de cellules par pas de temps. Chrome est généralement plus rapide que Safari pour ce type de charge numérique.</w:t>
       </w:r>
     </w:p>
+    <w:p/>
     <w:p>
       <w:pPr>
         <w:pStyle w:val="Titre1"/>
@@ -1558,6 +1856,7 @@
           <w:color w:val="222222"/>
           <w:sz w:val="18"/>
         </w:rPr>
+        <w:lastRenderedPageBreak/>
         <w:t>Vitesse = (h² / 3η) × (ρgh·pente − τ₀)   si ρgh·pente &gt; τ₀</w:t>
       </w:r>
       <w:r>
@@ -1861,14 +2160,6 @@
           <w:color w:val="888888"/>
           <w:sz w:val="18"/>
         </w:rPr>
-        <w:t xml:space="preserve"> et des Neiges</w:t>
-      </w:r>
-      <w:r>
-        <w:rPr>
-          <w:i/>
-          <w:color w:val="888888"/>
-          <w:sz w:val="18"/>
-        </w:rPr>
         <w:br/>
         <w:t>Données LiDAR HD IGN (data.geopf.fr) — accès libre</w:t>
       </w:r>
@@ -2056,31 +2347,31 @@
       </w:rPr>
     </w:lvl>
   </w:abstractNum>
-  <w:num w:numId="1" w16cid:durableId="355271482">
+  <w:num w:numId="1" w16cid:durableId="1708218949">
     <w:abstractNumId w:val="8"/>
   </w:num>
-  <w:num w:numId="2" w16cid:durableId="1246302049">
+  <w:num w:numId="2" w16cid:durableId="1037240584">
     <w:abstractNumId w:val="6"/>
   </w:num>
-  <w:num w:numId="3" w16cid:durableId="614213085">
+  <w:num w:numId="3" w16cid:durableId="4328986">
     <w:abstractNumId w:val="5"/>
   </w:num>
-  <w:num w:numId="4" w16cid:durableId="781848552">
+  <w:num w:numId="4" w16cid:durableId="903564716">
     <w:abstractNumId w:val="4"/>
   </w:num>
-  <w:num w:numId="5" w16cid:durableId="569267105">
+  <w:num w:numId="5" w16cid:durableId="380447895">
     <w:abstractNumId w:val="7"/>
   </w:num>
-  <w:num w:numId="6" w16cid:durableId="786386330">
+  <w:num w:numId="6" w16cid:durableId="765198634">
     <w:abstractNumId w:val="3"/>
   </w:num>
-  <w:num w:numId="7" w16cid:durableId="575631307">
+  <w:num w:numId="7" w16cid:durableId="570240221">
     <w:abstractNumId w:val="2"/>
   </w:num>
-  <w:num w:numId="8" w16cid:durableId="1274946825">
+  <w:num w:numId="8" w16cid:durableId="1821770029">
     <w:abstractNumId w:val="1"/>
   </w:num>
-  <w:num w:numId="9" w16cid:durableId="2101565277">
+  <w:num w:numId="9" w16cid:durableId="596401922">
     <w:abstractNumId w:val="0"/>
   </w:num>
 </w:numbering>

</xml_diff>